<commit_message>
P4: Added link to GitHub for reproducible research grade
</commit_message>
<xml_diff>
--- a/Project 4/Reports/P4 Final Report.docx
+++ b/Project 4/Reports/P4 Final Report.docx
@@ -76,7 +76,15 @@
         <w:t>,</w:t>
       </w:r>
       <w:r>
-        <w:t xml:space="preserve"> across scenarios that vary sample size and predictor correlation structure. For the penalized methods, two tuning strategies are investigated: selection of the penalty parameter λ via cross-validation minimizing mean squared error (λ_min) and via the one-standard-error rule (λ_1se), yielding seven method-tuning combinations in total. Performance is assessed in terms of each method's ability to correctly identify the five true predictors, avoid false inclusion of the fifteen null predictors, produce unbiased coefficient estimates for retained variables, and achieve nominal 95% confidence interval coverage.</w:t>
+        <w:t xml:space="preserve"> across scenarios that vary sample size and predictor correlation structure. For the penalized methods, two tuning strategies are investigated: selection of the penalty parameter λ via cross-validation minimizing mean squared error (</w:t>
+      </w:r>
+      <w:proofErr w:type="spellStart"/>
+      <w:r>
+        <w:t>λ_min</w:t>
+      </w:r>
+      <w:proofErr w:type="spellEnd"/>
+      <w:r>
+        <w:t>) and via the one-standard-error rule (λ_1se), yielding seven method-tuning combinations in total. Performance is assessed in terms of each method's ability to correctly identify the five true predictors, avoid false inclusion of the fifteen null predictors, produce unbiased coefficient estimates for retained variables, and achieve nominal 95% confidence interval coverage.</w:t>
       </w:r>
     </w:p>
     <w:p>
@@ -398,13 +406,7 @@
           <w:rPr>
             <w:rFonts w:ascii="Cambria Math" w:hAnsi="Cambria Math"/>
           </w:rPr>
-          <m:t>p=20</m:t>
-        </m:r>
-        <m:r>
-          <w:rPr>
-            <w:rFonts w:ascii="Cambria Math" w:hAnsi="Cambria Math"/>
-          </w:rPr>
-          <m:t xml:space="preserve"> </m:t>
+          <m:t xml:space="preserve">p=20 </m:t>
         </m:r>
       </m:oMath>
       <w:r>
@@ -440,13 +442,7 @@
           <w:rPr>
             <w:rFonts w:ascii="Cambria Math" w:hAnsi="Cambria Math"/>
           </w:rPr>
-          <m:t>=5</m:t>
-        </m:r>
-        <m:r>
-          <w:rPr>
-            <w:rFonts w:ascii="Cambria Math" w:hAnsi="Cambria Math"/>
-          </w:rPr>
-          <m:t xml:space="preserve"> </m:t>
+          <m:t xml:space="preserve">=5 </m:t>
         </m:r>
       </m:oMath>
       <w:r>
@@ -569,13 +565,7 @@
                 <w:rPr>
                   <w:rFonts w:ascii="Cambria Math" w:hAnsi="Cambria Math"/>
                 </w:rPr>
-                <m:t>,</m:t>
-              </m:r>
-              <m:r>
-                <w:rPr>
-                  <w:rFonts w:ascii="Cambria Math" w:hAnsi="Cambria Math"/>
-                </w:rPr>
-                <m:t xml:space="preserve"> </m:t>
+                <m:t xml:space="preserve">, </m:t>
               </m:r>
               <m:f>
                 <m:fPr>
@@ -623,13 +613,7 @@
                     <w:rPr>
                       <w:rFonts w:ascii="Cambria Math" w:hAnsi="Cambria Math"/>
                     </w:rPr>
-                    <m:t>1</m:t>
-                  </m:r>
-                  <m:r>
-                    <w:rPr>
-                      <w:rFonts w:ascii="Cambria Math" w:hAnsi="Cambria Math"/>
-                    </w:rPr>
-                    <m:t>.5</m:t>
+                    <m:t>1.5</m:t>
                   </m:r>
                 </m:num>
                 <m:den>
@@ -693,13 +677,7 @@
                     <w:rPr>
                       <w:rFonts w:ascii="Cambria Math" w:hAnsi="Cambria Math"/>
                     </w:rPr>
-                    <m:t>2</m:t>
-                  </m:r>
-                  <m:r>
-                    <w:rPr>
-                      <w:rFonts w:ascii="Cambria Math" w:hAnsi="Cambria Math"/>
-                    </w:rPr>
-                    <m:t>.5</m:t>
+                    <m:t>2.5</m:t>
                   </m:r>
                 </m:num>
                 <m:den>
@@ -715,25 +693,7 @@
                 <w:rPr>
                   <w:rFonts w:ascii="Cambria Math" w:hAnsi="Cambria Math"/>
                 </w:rPr>
-                <m:t>,</m:t>
-              </m:r>
-              <m:r>
-                <w:rPr>
-                  <w:rFonts w:ascii="Cambria Math" w:hAnsi="Cambria Math"/>
-                </w:rPr>
-                <m:t>0,0,…,0</m:t>
-              </m:r>
-              <m:r>
-                <w:rPr>
-                  <w:rFonts w:ascii="Cambria Math" w:hAnsi="Cambria Math"/>
-                </w:rPr>
-                <m:t xml:space="preserve"> </m:t>
-              </m:r>
-              <m:r>
-                <w:rPr>
-                  <w:rFonts w:ascii="Cambria Math" w:hAnsi="Cambria Math"/>
-                </w:rPr>
-                <m:t xml:space="preserve"> </m:t>
+                <m:t xml:space="preserve">,0,0,…,0  </m:t>
               </m:r>
             </m:e>
           </m:d>
@@ -1087,13 +1047,7 @@
           <w:rPr>
             <w:rFonts w:ascii="Cambria Math" w:hAnsi="Cambria Math"/>
           </w:rPr>
-          <m:t>ρ=0</m:t>
-        </m:r>
-        <m:r>
-          <w:rPr>
-            <w:rFonts w:ascii="Cambria Math" w:hAnsi="Cambria Math"/>
-          </w:rPr>
-          <m:t xml:space="preserve"> </m:t>
+          <m:t xml:space="preserve">ρ=0 </m:t>
         </m:r>
       </m:oMath>
       <w:r>
@@ -1104,13 +1058,7 @@
           <w:rPr>
             <w:rFonts w:ascii="Cambria Math" w:hAnsi="Cambria Math"/>
           </w:rPr>
-          <m:t>ρ=0.35</m:t>
-        </m:r>
-        <m:r>
-          <w:rPr>
-            <w:rFonts w:ascii="Cambria Math" w:hAnsi="Cambria Math"/>
-          </w:rPr>
-          <m:t xml:space="preserve"> </m:t>
+          <m:t xml:space="preserve">ρ=0.35 </m:t>
         </m:r>
       </m:oMath>
       <w:r>
@@ -1121,13 +1069,7 @@
           <w:rPr>
             <w:rFonts w:ascii="Cambria Math" w:hAnsi="Cambria Math"/>
           </w:rPr>
-          <m:t>ρ=0.70</m:t>
-        </m:r>
-        <m:r>
-          <w:rPr>
-            <w:rFonts w:ascii="Cambria Math" w:hAnsi="Cambria Math"/>
-          </w:rPr>
-          <m:t xml:space="preserve"> </m:t>
+          <m:t xml:space="preserve">ρ=0.70 </m:t>
         </m:r>
       </m:oMath>
       <w:r>
@@ -1167,7 +1109,15 @@
         <w:t>Backward Elimination by P-value.</w:t>
       </w:r>
       <w:r>
-        <w:t xml:space="preserve"> Beginning with the saturated model, variables were removed sequentially based on the least significant F-test statistic, with removal continuing until all remaining variables met a retention threshold of α = 0.05. This procedure was implemented using the step() function in R with the penalty parameter set to k = qchisq(0.95, 1).</w:t>
+        <w:t xml:space="preserve"> Beginning with the saturated model, variables were removed sequentially based on the least significant F-test statistic, with removal continuing until all remaining variables met a retention threshold of α = 0.05. This procedure was implemented using the step() function in R with the penalty parameter set to k = </w:t>
+      </w:r>
+      <w:proofErr w:type="spellStart"/>
+      <w:r>
+        <w:t>qchisq</w:t>
+      </w:r>
+      <w:proofErr w:type="spellEnd"/>
+      <w:r>
+        <w:t>(0.95, 1).</w:t>
       </w:r>
     </w:p>
     <w:p>
@@ -1182,7 +1132,15 @@
         <w:t>AIC-Based Backward Selection.</w:t>
       </w:r>
       <w:r>
-        <w:t xml:space="preserve"> Backward stepwise selection was performed minimizing the Akaike Information Criterion (AIC) at each step, implemented via step() with k = 2. AIC balances model fit against complexity with a fixed penalty of 2 per parameter, and tends to favor slightly larger models than BIC (Tibshirani, 1996).</w:t>
+        <w:t xml:space="preserve"> Backward stepwise selection was performed minimizing the Akaike Information Criterion (AIC) at each step, implemented via step() with k = 2. AIC balances model fit against complexity with a fixed penalty of 2 per parameter, and tends to favor slightly larger models than BIC (</w:t>
+      </w:r>
+      <w:proofErr w:type="spellStart"/>
+      <w:r>
+        <w:t>Tibshirani</w:t>
+      </w:r>
+      <w:proofErr w:type="spellEnd"/>
+      <w:r>
+        <w:t>, 1996).</w:t>
       </w:r>
     </w:p>
     <w:p>
@@ -1218,7 +1176,31 @@
         <w:t>Lasso Regression.</w:t>
       </w:r>
       <w:r>
-        <w:t xml:space="preserve"> The lasso (Tibshirani, 1996) minimizes the residual sum of squares subject to an L1 penalty on the coefficient vector, shrinking some coefficients exactly to zero and thereby performing simultaneous estimation and variable selection. The tuning parameter λ was selected via 10-fold cross-validation using two rules: (i) λ_min, which minimizes the cross-validated mean squared error, and (ii) λ_1se, which selects the largest λ within one standard error of the minimum, yielding a more parsimonious model. Predictors with nonzero coefficients at the chosen λ were considered selected.</w:t>
+        <w:t xml:space="preserve"> The lasso (</w:t>
+      </w:r>
+      <w:proofErr w:type="spellStart"/>
+      <w:r>
+        <w:t>Tibshirani</w:t>
+      </w:r>
+      <w:proofErr w:type="spellEnd"/>
+      <w:r>
+        <w:t>, 1996) minimizes the residual sum of squares subject to an L1 penalty on the coefficient vector, shrinking some coefficients exactly to zero and thereby performing simultaneous estimation and variable selection. The tuning parameter λ was selected via 10-fold cross-validation using two rules: (</w:t>
+      </w:r>
+      <w:proofErr w:type="spellStart"/>
+      <w:r>
+        <w:t>i</w:t>
+      </w:r>
+      <w:proofErr w:type="spellEnd"/>
+      <w:r>
+        <w:t xml:space="preserve">) </w:t>
+      </w:r>
+      <w:proofErr w:type="spellStart"/>
+      <w:r>
+        <w:t>λ_min</w:t>
+      </w:r>
+      <w:proofErr w:type="spellEnd"/>
+      <w:r>
+        <w:t>, which minimizes the cross-validated mean squared error, and (ii) λ_1se, which selects the largest λ within one standard error of the minimum, yielding a more parsimonious model. Predictors with nonzero coefficients at the chosen λ were considered selected.</w:t>
       </w:r>
     </w:p>
     <w:p>
@@ -1233,7 +1215,15 @@
         <w:t>Elastic Net Regression.</w:t>
       </w:r>
       <w:r>
-        <w:t xml:space="preserve"> The elastic net (Zou &amp; Hastie, 2005) combines the L1 penalty of the lasso with the L2 penalty of ridge regression via a mixing parameter α, where α = 1 reduces to the lasso and α = 0 reduces to ridge. A mixing parameter of α = 0.5 was used, reflecting an equal weighting of the two penalties. This approach retains the variable selection property of the lasso while improving stability in the presence of correlated predictors. As with lasso, λ was selected using both λ_min and λ_1se via 10-fold cross-validation.</w:t>
+        <w:t xml:space="preserve"> The elastic net (Zou &amp; Hastie, 2005) combines the L1 penalty of the lasso with the L2 penalty of ridge regression via a mixing parameter α, where α = 1 reduces to the lasso and α = 0 reduces to ridge. A mixing parameter of α = 0.5 was used, reflecting an equal weighting of the two penalties. This approach retains the variable selection property of the lasso while improving stability in the presence of correlated predictors. As with lasso, λ was selected using both </w:t>
+      </w:r>
+      <w:proofErr w:type="spellStart"/>
+      <w:r>
+        <w:t>λ_min</w:t>
+      </w:r>
+      <w:proofErr w:type="spellEnd"/>
+      <w:r>
+        <w:t xml:space="preserve"> and λ_1se via 10-fold cross-validation.</w:t>
       </w:r>
     </w:p>
     <w:p>
@@ -1248,7 +1238,15 @@
         <w:t>Post-Selection Inference.</w:t>
       </w:r>
       <w:r>
-        <w:t xml:space="preserve"> For all methods, once a final set of variables was selected, an ordinary least squares (OLS) model was refit on only those selected variables, and inference (coefficient estimates, standard errors, and confidence intervals) was drawn from this refitted model as though no variable selection had been performed. This approach is standard in practice but is known to introduce bias in coefficient estimates and anti-conservative confidence interval coverage, since the selection step and the inference step are not independent (Tibshirani, 1996; Chong &amp; Jun, 2005). This limitation is acknowledged and discussed in the context of the results.</w:t>
+        <w:t xml:space="preserve"> For all methods, once a final set of variables was selected, an ordinary least squares (OLS) model was refit on only those selected variables, and inference (coefficient estimates, standard errors, and confidence intervals) was drawn from this refitted model as though no variable selection had been performed. This approach is standard in practice but is known to introduce bias in coefficient estimates and anti-conservative confidence interval coverage, since the selection step and the inference step are not independent (</w:t>
+      </w:r>
+      <w:proofErr w:type="spellStart"/>
+      <w:r>
+        <w:t>Tibshirani</w:t>
+      </w:r>
+      <w:proofErr w:type="spellEnd"/>
+      <w:r>
+        <w:t>, 1996; Chong &amp; Jun, 2005). This limitation is acknowledged and discussed in the context of the results.</w:t>
       </w:r>
     </w:p>
     <w:p>
@@ -1270,7 +1268,15 @@
         <w:spacing w:line="240" w:lineRule="auto"/>
       </w:pPr>
       <w:r>
-        <w:t xml:space="preserve">Data were generated using the hdrm package in R across six simulation scenarios defined by crossing two sample sizes (N = 250, N = 500) with three levels of exchangeable predictor correlation (ρ = 0, 0.35, 0.70). In each scenario, 2,500 replications were performed, a number chosen to ensure a Monte Carlo standard error of no greater than 0.01 for a proportion near 0.5, derived from the formula </w:t>
+        <w:t xml:space="preserve">Data were generated using the </w:t>
+      </w:r>
+      <w:proofErr w:type="spellStart"/>
+      <w:r>
+        <w:t>hdrm</w:t>
+      </w:r>
+      <w:proofErr w:type="spellEnd"/>
+      <w:r>
+        <w:t xml:space="preserve"> package in R across six simulation scenarios defined by crossing two sample sizes (N = 250, N = 500) with three levels of exchangeable predictor correlation (ρ = 0, 0.35, 0.70). In each scenario, 2,500 replications were performed, a number chosen to ensure a Monte Carlo standard error of no greater than 0.01 for a proportion near 0.5, derived from the formula </w:t>
       </w:r>
       <m:oMath>
         <m:r>
@@ -1327,7 +1333,15 @@
         <w:t xml:space="preserve"> </w:t>
       </w:r>
       <w:r>
-        <w:t>where B is the number of replications. Simulations were distributed across 12 parallel cores using the future.apply package in R with a global seed of 42 to ensure reproducibility.</w:t>
+        <w:t xml:space="preserve">where B is the number of replications. Simulations were distributed across 12 parallel cores using the </w:t>
+      </w:r>
+      <w:proofErr w:type="spellStart"/>
+      <w:r>
+        <w:t>future.apply</w:t>
+      </w:r>
+      <w:proofErr w:type="spellEnd"/>
+      <w:r>
+        <w:t xml:space="preserve"> package in R with a global seed of 42 to ensure reproducibility.</w:t>
       </w:r>
     </w:p>
     <w:p>
@@ -1335,7 +1349,23 @@
         <w:spacing w:line="240" w:lineRule="auto"/>
       </w:pPr>
       <w:r>
-        <w:t>At each replication, a dataset of N observations was generated from the linear model described in the Model Notation section. Predictor variables were drawn from a multivariate normal distribution with mean zero and an exchangeable correlation structure parameterized by ρ. All seven method-tuning combinations were applied to each simulated dataset. For the lasso and elastic net, the penalized model was fit using cv.glmnet() from the glmnet package with 10-fold cross-validation and predictors standardized prior to fitting. Variables with nonzero coefficients at the chosen λ were considered selected, and an OLS model was then refit on the selected variables for inference.</w:t>
+        <w:t xml:space="preserve">At each replication, a dataset of N observations was generated from the linear model described in the Model Notation section. Predictor variables were drawn from a multivariate normal distribution with mean zero and an exchangeable correlation structure parameterized by ρ. All seven method-tuning combinations were applied to each simulated dataset. For the lasso and elastic net, the penalized model was fit using </w:t>
+      </w:r>
+      <w:proofErr w:type="spellStart"/>
+      <w:r>
+        <w:t>cv.glmnet</w:t>
+      </w:r>
+      <w:proofErr w:type="spellEnd"/>
+      <w:r>
+        <w:t xml:space="preserve">() from the </w:t>
+      </w:r>
+      <w:proofErr w:type="spellStart"/>
+      <w:r>
+        <w:t>glmnet</w:t>
+      </w:r>
+      <w:proofErr w:type="spellEnd"/>
+      <w:r>
+        <w:t xml:space="preserve"> package with 10-fold cross-validation and predictors standardized prior to fitting. Variables with nonzero coefficients at the chosen λ were considered selected, and an OLS model was then refit on the selected variables for inference.</w:t>
       </w:r>
     </w:p>
     <w:p>
@@ -1407,7 +1437,23 @@
         <w:t xml:space="preserve">, </w:t>
       </w:r>
       <w:r>
-        <w:t>averaged across the five true predictors by method and scenario. Overall, most methods performed well in recovering the true predictors, with the majority exceeding 90% TPR across scenarios. EN05_min achieved the highest and most consistent TPR, reaching or approaching 100% in nearly all scenarios. LASSO_min and LASSO_1se performed similarly well, with LASSO_min slightly outperforming LASSO_1se, as expected given that λ_1se applies a stronger penalty. AIC and PVAL also performed competitively, generally exceeding 90% TPR. BIC showed the weakest sensitivity, particularly in the high-correlation, small-sample scenario (N = 250, ρ = 0.70), where mean TPR fell to approximately 80%. This is consistent with BIC's heavier complexity penalty, which favors sparser models and can miss true predictors with modest effect sizes. Increasing sample size from N = 250 to N = 500 generally improved TPR across all methods, and the effect of correlation on TPR was most pronounced for BIC.</w:t>
+        <w:t xml:space="preserve">averaged across the five true predictors by method and scenario. Overall, most methods performed well in recovering the true predictors, with the majority exceeding 90% TPR across scenarios. EN05_min achieved the highest and most consistent TPR, reaching or approaching 100% in nearly all scenarios. </w:t>
+      </w:r>
+      <w:proofErr w:type="spellStart"/>
+      <w:r>
+        <w:t>LASSO_min</w:t>
+      </w:r>
+      <w:proofErr w:type="spellEnd"/>
+      <w:r>
+        <w:t xml:space="preserve"> and LASSO_1se performed similarly well, with </w:t>
+      </w:r>
+      <w:proofErr w:type="spellStart"/>
+      <w:r>
+        <w:t>LASSO_min</w:t>
+      </w:r>
+      <w:proofErr w:type="spellEnd"/>
+      <w:r>
+        <w:t xml:space="preserve"> slightly outperforming LASSO_1se, as expected given that λ_1se applies a stronger penalty. AIC and PVAL also performed competitively, generally exceeding 90% TPR. BIC showed the weakest sensitivity, particularly in the high-correlation, small-sample scenario (N = 250, ρ = 0.70), where mean TPR fell to approximately 80%. This is consistent with BIC's heavier complexity penalty, which favors sparser models and can miss true predictors with modest effect sizes. Increasing sample size from N = 250 to N = 500 generally improved TPR across all methods, and the effect of correlation on TPR was most pronounced for BIC.</w:t>
       </w:r>
     </w:p>
     <w:p>
@@ -1415,6 +1461,9 @@
         <w:jc w:val="center"/>
       </w:pPr>
       <w:r>
+        <w:rPr>
+          <w:noProof/>
+        </w:rPr>
         <w:drawing>
           <wp:inline distT="0" distB="0" distL="0" distR="0" wp14:anchorId="318C9A3A" wp14:editId="39293EB2">
             <wp:extent cx="6386569" cy="3726180"/>
@@ -1508,11 +1557,30 @@
         <w:t xml:space="preserve">, </w:t>
       </w:r>
       <w:r>
-        <w:t>averaged across the 15 null predictors. The results reveal a striking trade-off between sensitivity and specificity across methods. EN05_min and LASSO_min, despite their strong TPR performance, exhibited the highest FPR of all methods, reaching approximately 49% and 40% respectively in the N = 250, ρ = 0 scenario, and exceeding 50% in some N = 500 scenarios. This indicates that while these methods reliably include the true predictors, they do so at the cost of also including large numbers of null predictors. Predictor correlation further inflated FPR for both EN05_min and EN05_1se, with high correlation (ρ = 0.70) producing FPR values exceeding 40% for EN05_1se. In contrast, BIC achieved the lowest FPR across all scenarios, consistently remaining below 3%, reflecting its aggressive penalization of model complexity. PVAL and LASSO_1se struck a more favorable middle ground, with PVAL maintaining FPR near 5–6% across scenarios and LASSO_1se ranging from approximately 2% to 20% depending on correlation level. These results highlight that λ selection has a profound impact on the behavior of penalized methods: λ_min prioritizes prediction accuracy and recovers true predictors reliably but at a high false discovery cost, while λ_1se is considerably more conservative.</w:t>
-      </w:r>
-    </w:p>
-    <w:p>
-      <w:r>
+        <w:t xml:space="preserve">averaged across the 15 null predictors. The results reveal a striking trade-off between sensitivity and specificity across methods. EN05_min and </w:t>
+      </w:r>
+      <w:proofErr w:type="spellStart"/>
+      <w:r>
+        <w:t>LASSO_min</w:t>
+      </w:r>
+      <w:proofErr w:type="spellEnd"/>
+      <w:r>
+        <w:t xml:space="preserve">, despite their strong TPR performance, exhibited the highest FPR of all methods, reaching approximately 49% and 40% respectively in the N = 250, ρ = 0 scenario, and exceeding 50% in some N = 500 scenarios. This indicates that while these methods reliably include the true predictors, they do so at the cost of also including large numbers of null predictors. Predictor correlation further inflated FPR for both EN05_min and EN05_1se, with high correlation (ρ = 0.70) producing FPR values exceeding 40% for EN05_1se. In contrast, BIC achieved the lowest FPR across all scenarios, consistently remaining below 3%, reflecting its aggressive penalization of model complexity. PVAL and LASSO_1se struck a more favorable middle ground, with PVAL maintaining FPR near 5–6% across scenarios and LASSO_1se ranging from approximately 2% to 20% depending on correlation level. These results highlight that λ selection has a profound impact on the behavior of penalized methods: </w:t>
+      </w:r>
+      <w:proofErr w:type="spellStart"/>
+      <w:r>
+        <w:t>λ_min</w:t>
+      </w:r>
+      <w:proofErr w:type="spellEnd"/>
+      <w:r>
+        <w:t xml:space="preserve"> prioritizes prediction accuracy and recovers true predictors reliably but at a high false discovery cost, while λ_1se is considerably more conservative.</w:t>
+      </w:r>
+    </w:p>
+    <w:p>
+      <w:r>
+        <w:rPr>
+          <w:noProof/>
+        </w:rPr>
         <w:drawing>
           <wp:inline distT="0" distB="0" distL="0" distR="0" wp14:anchorId="258BA3FF" wp14:editId="64359404">
             <wp:extent cx="6278880" cy="3680792"/>
@@ -1613,8 +1681,13 @@
         <w:t>,</w:t>
       </w:r>
       <w:r>
-        <w:t xml:space="preserve"> particularly EN05_min and LASSO_min</w:t>
-      </w:r>
+        <w:t xml:space="preserve"> particularly EN05_min and </w:t>
+      </w:r>
+      <w:proofErr w:type="spellStart"/>
+      <w:r>
+        <w:t>LASSO_min</w:t>
+      </w:r>
+      <w:proofErr w:type="spellEnd"/>
       <w:r>
         <w:t xml:space="preserve">, </w:t>
       </w:r>
@@ -1639,7 +1712,15 @@
         <w:spacing w:line="240" w:lineRule="auto"/>
       </w:pPr>
       <w:r>
-        <w:t>Bias results were computed for the five true predictors across all methods and scenarios, with non-selected variables assigned an implicit estimate of zero. Across all methods, bias was most pronounced for the weakest true predictor (X1, β = 0.5/3 ≈ 0.167) and diminished as coefficient magnitude increased toward X5 (β = 2.5/3 ≈ 0.833). This pattern reflects the well-known attenuation bias associated with post-selection inference: variables with smaller true effects are more frequently missed by the selection step, and when their estimate is imputed as zero, the average estimate is pulled toward zero. Methods with lower TPR for weak predictors, particularly BIC, exhibited the largest bias for X1 and X2. Penalized methods using λ_min showed relatively modest bias given their high selection rates, though the shrinkage inherent in the lasso and elastic net introduces some downward bias in estimates even when variables are selected. Larger sample size (N = 500) generally reduced bias across all methods.</w:t>
+        <w:t xml:space="preserve">Bias results were computed for the five true predictors across all methods and scenarios, with non-selected variables assigned an implicit estimate of zero. Across all methods, bias was most pronounced for the weakest true predictor (X1, β = 0.5/3 ≈ 0.167) and diminished as coefficient magnitude increased toward X5 (β = 2.5/3 ≈ 0.833). This pattern reflects the well-known attenuation bias associated with post-selection inference: variables with smaller true effects are more frequently missed by the selection step, and when their estimate is imputed as zero, the average estimate is pulled toward zero. Methods with lower TPR for weak predictors, particularly BIC, exhibited the largest bias for X1 and X2. Penalized methods using </w:t>
+      </w:r>
+      <w:proofErr w:type="spellStart"/>
+      <w:r>
+        <w:t>λ_min</w:t>
+      </w:r>
+      <w:proofErr w:type="spellEnd"/>
+      <w:r>
+        <w:t xml:space="preserve"> showed relatively modest bias given their high selection rates, though the shrinkage inherent in the lasso and elastic net introduces some downward bias in estimates even when variables are selected. Larger sample size (N = 500) generally reduced bias across all methods.</w:t>
       </w:r>
     </w:p>
     <w:p>
@@ -1659,7 +1740,15 @@
         <w:spacing w:line="240" w:lineRule="auto"/>
       </w:pPr>
       <w:r>
-        <w:t>Figure 3 displays the 95% CI coverage for the true predictors by method and scenario. No method achieved nominal 95% coverage consistently across all scenarios, a finding that underscores the consequences of performing inference after variable selection without correction. The closest approximation to nominal coverage was observed for EN05_min and LASSO_min at N = 500, ρ = 0, where coverage approached 95%. Coverage degraded substantially as predictor correlation increased, with the most severe under-coverage observed for BIC at N = 250, ρ = 0.70, where coverage fell to approximately 74%. This is a direct consequence of BIC's tendency to exclude weakly associated true predictors under high correlation, assigning them an implicit estimate of zero with no associated interval. AIC and PVAL showed moderate under-coverage ranging from approximately 84% to 95% depending on scenario. The consistent below-nominal coverage across all methods confirms that refitting the final selected model as though no selection occurred produces anti-conservative inference, and that this problem is exacerbated under high correlation and small sample sizes.</w:t>
+        <w:t xml:space="preserve">Figure 3 displays the 95% CI coverage for the true predictors by method and scenario. No method achieved nominal 95% coverage consistently across all scenarios, a finding that underscores the consequences of performing inference after variable selection without correction. The closest approximation to nominal coverage was observed for EN05_min and </w:t>
+      </w:r>
+      <w:proofErr w:type="spellStart"/>
+      <w:r>
+        <w:t>LASSO_min</w:t>
+      </w:r>
+      <w:proofErr w:type="spellEnd"/>
+      <w:r>
+        <w:t xml:space="preserve"> at N = 500, ρ = 0, where coverage approached 95%. Coverage degraded substantially as predictor correlation increased, with the most severe under-coverage observed for BIC at N = 250, ρ = 0.70, where coverage fell to approximately 74%. This is a direct consequence of BIC's tendency to exclude weakly associated true predictors under high correlation, assigning them an implicit estimate of zero with no associated interval. AIC and PVAL showed moderate under-coverage ranging from approximately 84% to 95% depending on scenario. The consistent below-nominal coverage across all methods confirms that refitting the final selected model as though no selection occurred produces anti-conservative inference, and that this problem is exacerbated under high correlation and small sample sizes.</w:t>
       </w:r>
     </w:p>
     <w:p>
@@ -1667,6 +1756,9 @@
         <w:jc w:val="center"/>
       </w:pPr>
       <w:r>
+        <w:rPr>
+          <w:noProof/>
+        </w:rPr>
         <w:lastRenderedPageBreak/>
         <w:drawing>
           <wp:inline distT="0" distB="0" distL="0" distR="0" wp14:anchorId="60CC3E72" wp14:editId="73F5A1E0">
@@ -1744,7 +1836,15 @@
         <w:spacing w:line="240" w:lineRule="auto"/>
       </w:pPr>
       <w:r>
-        <w:t>Type I error results, computed among null predictors that were selected and subsequently tested in the refitted OLS model, were generally well-controlled near the nominal α = 0.05 level across all methods. This is expected, as once a null predictor is included in the refitted model and tested in the absence of any true association, the test behaves approximately as intended. Type II error results, computed for true predictors as the proportion of replications in which the variable was either not selected or failed to reach significance in the refitted model, were most elevated for BIC across all scenarios and were especially high for X1 and X2, reflecting the difficulty of detecting the weakest effects. Methods with high TPR and high FPR, such as EN05_min and LASSO_min, had the lowest Type II error for true predictors, though this came at the cost of the high false positive burden already noted.</w:t>
+        <w:t xml:space="preserve">Type I error results, computed among null predictors that were selected and subsequently tested in the refitted OLS model, were generally well-controlled near the nominal α = 0.05 level across all methods. This is expected, as once a null predictor is included in the refitted model and tested in the absence of any true association, the test behaves approximately as intended. Type II error results, computed for true predictors as the proportion of replications in which the variable was either not selected or failed to reach significance in the refitted model, were most elevated for BIC across all scenarios and were especially high for X1 and X2, reflecting the difficulty of detecting the weakest effects. Methods with high TPR and high FPR, such as EN05_min and </w:t>
+      </w:r>
+      <w:proofErr w:type="spellStart"/>
+      <w:r>
+        <w:t>LASSO_min</w:t>
+      </w:r>
+      <w:proofErr w:type="spellEnd"/>
+      <w:r>
+        <w:t>, had the lowest Type II error for true predictors, though this came at the cost of the high false positive burden already noted.</w:t>
       </w:r>
     </w:p>
     <w:p>
@@ -1770,7 +1870,15 @@
         <w:t xml:space="preserve">overall </w:t>
       </w:r>
       <w:r>
-        <w:t xml:space="preserve">goals. When maximizing sensitivity is the priority, EN05_min or LASSO_min are the strongest performers, though high false positive rates make them poorly suited for settings where parsimony matters. BIC is the clear choice when false discovery control is paramount, though be aware of its reduced power under high correlation and modest effect sizes. PVAL and LASSO_1se represent the most balanced approaches overall, offering reasonable sensitivity while maintaining acceptable false positive rates. Regardless of method, high predictor correlation consistently posed the greatest challenge across all metrics, and the universal under-coverage observed confirms </w:t>
+        <w:t xml:space="preserve">goals. When maximizing sensitivity is the priority, EN05_min or </w:t>
+      </w:r>
+      <w:proofErr w:type="spellStart"/>
+      <w:r>
+        <w:t>LASSO_min</w:t>
+      </w:r>
+      <w:proofErr w:type="spellEnd"/>
+      <w:r>
+        <w:t xml:space="preserve"> are the strongest performers, though high false positive rates make them poorly suited for settings where parsimony matters. BIC is the clear choice when false discovery control is paramount, though be aware of its reduced power under high correlation and modest effect sizes. PVAL and LASSO_1se represent the most balanced approaches overall, offering reasonable sensitivity while maintaining acceptable false positive rates. Regardless of method, high predictor correlation consistently posed the greatest challenge across all metrics, and the universal under-coverage observed confirms </w:t>
       </w:r>
       <w:r>
         <w:lastRenderedPageBreak/>
@@ -1854,7 +1962,15 @@
         <w:spacing w:line="240" w:lineRule="auto"/>
       </w:pPr>
       <w:r>
-        <w:t>Another promising extension involves exploring alternative tuning strategies for penalized regression beyond λ_min and λ_1se, such as stability selection or information</w:t>
+        <w:t xml:space="preserve">Another promising extension involves exploring alternative tuning strategies for penalized regression beyond </w:t>
+      </w:r>
+      <w:proofErr w:type="spellStart"/>
+      <w:r>
+        <w:t>λ_min</w:t>
+      </w:r>
+      <w:proofErr w:type="spellEnd"/>
+      <w:r>
+        <w:t xml:space="preserve"> and λ_1se, such as stability selection or information</w:t>
       </w:r>
       <w:r>
         <w:rPr>
@@ -1891,6 +2007,41 @@
       </w:r>
       <w:r>
         <w:t>noise ratio or allowing heterogeneous effect sizes would also provide insight into method performance when true signals are weaker or unevenly distributed. Finally, extending the simulation framework to generalized linear models would help determine whether the patterns observed here generalize to binary or count outcomes commonly encountered in applied research.</w:t>
+      </w:r>
+    </w:p>
+    <w:p>
+      <w:pPr>
+        <w:spacing w:line="240" w:lineRule="auto"/>
+      </w:pPr>
+    </w:p>
+    <w:p>
+      <w:pPr>
+        <w:spacing w:line="240" w:lineRule="auto"/>
+        <w:rPr>
+          <w:u w:val="single"/>
+        </w:rPr>
+      </w:pPr>
+      <w:r>
+        <w:rPr>
+          <w:u w:val="single"/>
+        </w:rPr>
+        <w:t>Reproducible Research</w:t>
+      </w:r>
+    </w:p>
+    <w:p>
+      <w:pPr>
+        <w:spacing w:line="240" w:lineRule="auto"/>
+      </w:pPr>
+      <w:hyperlink r:id="rId7" w:history="1">
+        <w:r>
+          <w:rPr>
+            <w:rStyle w:val="Hyperlink"/>
+          </w:rPr>
+          <w:t>https://github.com/asteinwand/BIOS6624</w:t>
+        </w:r>
+      </w:hyperlink>
+      <w:r>
+        <w:t xml:space="preserve"> </w:t>
       </w:r>
     </w:p>
     <w:p>
@@ -1945,7 +2096,7 @@
                           </pic:cNvPicPr>
                         </pic:nvPicPr>
                         <pic:blipFill>
-                          <a:blip r:embed="rId7" cstate="print">
+                          <a:blip r:embed="rId8" cstate="print">
                             <a:extLst>
                               <a:ext uri="{28A0092B-C50C-407E-A947-70E740481C1C}">
                                 <a14:useLocalDpi xmlns:a14="http://schemas.microsoft.com/office/drawing/2010/main" val="0"/>
@@ -1974,7 +2125,7 @@
                           </pic:cNvPicPr>
                         </pic:nvPicPr>
                         <pic:blipFill>
-                          <a:blip r:embed="rId8" cstate="print">
+                          <a:blip r:embed="rId9" cstate="print">
                             <a:extLst>
                               <a:ext uri="{28A0092B-C50C-407E-A947-70E740481C1C}">
                                 <a14:useLocalDpi xmlns:a14="http://schemas.microsoft.com/office/drawing/2010/main" val="0"/>
@@ -2003,7 +2154,7 @@
                           </pic:cNvPicPr>
                         </pic:nvPicPr>
                         <pic:blipFill>
-                          <a:blip r:embed="rId9" cstate="print">
+                          <a:blip r:embed="rId10" cstate="print">
                             <a:extLst>
                               <a:ext uri="{28A0092B-C50C-407E-A947-70E740481C1C}">
                                 <a14:useLocalDpi xmlns:a14="http://schemas.microsoft.com/office/drawing/2010/main" val="0"/>
@@ -2053,13 +2204,13 @@
                   <o:lock v:ext="edit" aspectratio="t"/>
                 </v:shapetype>
                 <v:shape id="Picture 1" o:spid="_x0000_s1027" type="#_x0000_t75" style="position:absolute;width:23774;height:37553;visibility:visible;mso-wrap-style:square" o:gfxdata="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">
-                  <v:imagedata r:id="rId10" o:title=""/>
+                  <v:imagedata r:id="rId11" o:title=""/>
                 </v:shape>
                 <v:shape id="Picture 1" o:spid="_x0000_s1028" type="#_x0000_t75" style="position:absolute;left:24231;top:3886;width:21641;height:34131;visibility:visible;mso-wrap-style:square" o:gfxdata="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">
-                  <v:imagedata r:id="rId11" o:title=""/>
+                  <v:imagedata r:id="rId12" o:title=""/>
                 </v:shape>
                 <v:shape id="Picture 1" o:spid="_x0000_s1029" type="#_x0000_t75" style="position:absolute;left:45872;top:3810;width:20879;height:10890;visibility:visible;mso-wrap-style:square" o:gfxdata="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">
-                  <v:imagedata r:id="rId12" o:title=""/>
+                  <v:imagedata r:id="rId13" o:title=""/>
                 </v:shape>
               </v:group>
             </w:pict>
@@ -2752,6 +2903,7 @@
   <w:style w:type="character" w:default="1" w:styleId="DefaultParagraphFont">
     <w:name w:val="Default Paragraph Font"/>
     <w:uiPriority w:val="1"/>
+    <w:semiHidden/>
     <w:unhideWhenUsed/>
   </w:style>
   <w:style w:type="table" w:default="1" w:styleId="TableNormal">
@@ -3075,6 +3227,29 @@
       <w:color w:val="666666"/>
     </w:rPr>
   </w:style>
+  <w:style w:type="character" w:styleId="Hyperlink">
+    <w:name w:val="Hyperlink"/>
+    <w:basedOn w:val="DefaultParagraphFont"/>
+    <w:uiPriority w:val="99"/>
+    <w:unhideWhenUsed/>
+    <w:rsid w:val="007B1713"/>
+    <w:rPr>
+      <w:color w:val="467886" w:themeColor="hyperlink"/>
+      <w:u w:val="single"/>
+    </w:rPr>
+  </w:style>
+  <w:style w:type="character" w:styleId="UnresolvedMention">
+    <w:name w:val="Unresolved Mention"/>
+    <w:basedOn w:val="DefaultParagraphFont"/>
+    <w:uiPriority w:val="99"/>
+    <w:semiHidden/>
+    <w:unhideWhenUsed/>
+    <w:rsid w:val="007B1713"/>
+    <w:rPr>
+      <w:color w:val="605E5C"/>
+      <w:shd w:val="clear" w:color="auto" w:fill="E1DFDD"/>
+    </w:rPr>
+  </w:style>
 </w:styles>
 </file>
 

</xml_diff>